<commit_message>
docs: update benchmark design and development workflow
</commit_message>
<xml_diff>
--- a/docs sys design/System Design Draft.docx
+++ b/docs sys design/System Design Draft.docx
@@ -51,6 +51,7 @@
         <w:rPr>
           <w:b/>
           <w:bCs/>
+          <w:color w:val="EE0000"/>
         </w:rPr>
       </w:pPr>
       <w:r>
@@ -59,23 +60,24 @@
           <w:bCs/>
           <w:color w:val="EE0000"/>
         </w:rPr>
-        <w:t>C</w:t>
-      </w:r>
-      <w:r>
+        <w:t>Understand benchmark code</w:t>
+      </w:r>
+    </w:p>
+    <w:p>
+      <w:pPr>
         <w:rPr>
           <w:b/>
           <w:bCs/>
           <w:color w:val="EE0000"/>
         </w:rPr>
-        <w:t xml:space="preserve">ross reference with SEC filing selection </w:t>
-      </w:r>
+      </w:pPr>
       <w:r>
         <w:rPr>
           <w:b/>
           <w:bCs/>
           <w:color w:val="EE0000"/>
         </w:rPr>
-        <w:t xml:space="preserve">&amp; </w:t>
+        <w:t xml:space="preserve">Check if benchmark accounts for failure points in RAG research. </w:t>
       </w:r>
       <w:r>
         <w:rPr>
@@ -83,7 +85,7 @@
           <w:bCs/>
           <w:color w:val="EE0000"/>
         </w:rPr>
-        <w:t>parsing strategy in both MD files</w:t>
+        <w:t>T</w:t>
       </w:r>
       <w:r>
         <w:rPr>
@@ -91,7 +93,7 @@
           <w:bCs/>
           <w:color w:val="EE0000"/>
         </w:rPr>
-        <w:t>.</w:t>
+        <w:t>hen start building system design</w:t>
       </w:r>
       <w:r>
         <w:rPr>
@@ -99,23 +101,25 @@
           <w:bCs/>
           <w:color w:val="EE0000"/>
         </w:rPr>
-        <w:t xml:space="preserve"> </w:t>
-      </w:r>
+        <w:t xml:space="preserve"> – using basic </w:t>
+      </w:r>
+      <w:proofErr w:type="spellStart"/>
       <w:r>
         <w:rPr>
           <w:b/>
           <w:bCs/>
           <w:color w:val="EE0000"/>
         </w:rPr>
-        <w:t>T</w:t>
-      </w:r>
+        <w:t>chatgpt</w:t>
+      </w:r>
+      <w:proofErr w:type="spellEnd"/>
       <w:r>
         <w:rPr>
           <w:b/>
           <w:bCs/>
           <w:color w:val="EE0000"/>
         </w:rPr>
-        <w:t>hen start building system design</w:t>
+        <w:t xml:space="preserve"> notes</w:t>
       </w:r>
       <w:r>
         <w:rPr>
@@ -123,7 +127,7 @@
           <w:bCs/>
           <w:color w:val="EE0000"/>
         </w:rPr>
-        <w:t xml:space="preserve"> – using basic </w:t>
+        <w:t xml:space="preserve">, </w:t>
       </w:r>
       <w:proofErr w:type="spellStart"/>
       <w:r>
@@ -132,7 +136,7 @@
           <w:bCs/>
           <w:color w:val="EE0000"/>
         </w:rPr>
-        <w:t>chatgpt</w:t>
+        <w:t>boot.dev</w:t>
       </w:r>
       <w:proofErr w:type="spellEnd"/>
       <w:r>
@@ -141,33 +145,33 @@
           <w:bCs/>
           <w:color w:val="EE0000"/>
         </w:rPr>
-        <w:t xml:space="preserve"> notes</w:t>
-      </w:r>
+        <w:t xml:space="preserve">, codebase retrieval parsing md (and </w:t>
+      </w:r>
+      <w:proofErr w:type="spellStart"/>
       <w:r>
         <w:rPr>
           <w:b/>
           <w:bCs/>
           <w:color w:val="EE0000"/>
         </w:rPr>
-        <w:t xml:space="preserve">, </w:t>
-      </w:r>
-      <w:proofErr w:type="spellStart"/>
+        <w:t>maybeeee</w:t>
+      </w:r>
+      <w:proofErr w:type="spellEnd"/>
       <w:r>
         <w:rPr>
           <w:b/>
           <w:bCs/>
           <w:color w:val="EE0000"/>
         </w:rPr>
-        <w:t>boot.dev</w:t>
-      </w:r>
-      <w:proofErr w:type="spellEnd"/>
+        <w:t xml:space="preserve"> lit review stuff</w:t>
+      </w:r>
       <w:r>
         <w:rPr>
           <w:b/>
           <w:bCs/>
           <w:color w:val="EE0000"/>
         </w:rPr>
-        <w:t xml:space="preserve">, codebase retrieval parsing md (and </w:t>
+        <w:t xml:space="preserve"> + </w:t>
       </w:r>
       <w:proofErr w:type="spellStart"/>
       <w:r>
@@ -176,7 +180,7 @@
           <w:bCs/>
           <w:color w:val="EE0000"/>
         </w:rPr>
-        <w:t>maybeeee</w:t>
+        <w:t>claude</w:t>
       </w:r>
       <w:proofErr w:type="spellEnd"/>
       <w:r>
@@ -185,7 +189,7 @@
           <w:bCs/>
           <w:color w:val="EE0000"/>
         </w:rPr>
-        <w:t xml:space="preserve"> lit review stuff).</w:t>
+        <w:t xml:space="preserve"> convos</w:t>
       </w:r>
       <w:r>
         <w:rPr>
@@ -193,7 +197,7 @@
           <w:bCs/>
           <w:color w:val="EE0000"/>
         </w:rPr>
-        <w:t xml:space="preserve"> Then, identify failure points in architecture and if benchmark can help with this. Then </w:t>
+        <w:t>).</w:t>
       </w:r>
       <w:r>
         <w:rPr>
@@ -201,23 +205,23 @@
           <w:bCs/>
           <w:color w:val="EE0000"/>
         </w:rPr>
-        <w:t>code up</w:t>
-      </w:r>
+        <w:t xml:space="preserve"> </w:t>
+      </w:r>
+    </w:p>
+    <w:p>
+      <w:pPr>
+        <w:rPr>
+          <w:b/>
+          <w:bCs/>
+        </w:rPr>
+      </w:pPr>
       <w:r>
         <w:rPr>
           <w:b/>
           <w:bCs/>
           <w:color w:val="EE0000"/>
         </w:rPr>
-        <w:t xml:space="preserve"> benchmark</w:t>
-      </w:r>
-      <w:r>
-        <w:rPr>
-          <w:b/>
-          <w:bCs/>
-          <w:color w:val="EE0000"/>
-        </w:rPr>
-        <w:t>.</w:t>
+        <w:t xml:space="preserve">Then, identify failure points in architecture and if benchmark can help with this. </w:t>
       </w:r>
     </w:p>
     <w:p>

</xml_diff>